<commit_message>
Tarea de Servicios y Procesos RA1 terminada
</commit_message>
<xml_diff>
--- a/Programacion_Ser_Proc/RA1_A1_Fundamentos.docx
+++ b/Programacion_Ser_Proc/RA1_A1_Fundamentos.docx
@@ -4,24 +4,12 @@
   <w:body>
     <w:p>
       <w:pPr>
-        <w:pStyle w:val="Subtitle"/>
-        <w:spacing w:lineRule="auto" w:line="240"/>
-        <w:ind w:hanging="0" w:start="0"/>
+        <w:pStyle w:val="Title"/>
         <w:jc w:val="center"/>
-        <w:rPr>
-          <w:rFonts w:ascii="Times New Roman" w:hAnsi="Times New Roman"/>
-          <w:b/>
-          <w:bCs/>
-        </w:rPr>
+        <w:rPr/>
       </w:pPr>
       <w:r>
-        <w:rPr>
-          <w:rFonts w:cs="Calibri" w:ascii="Times New Roman" w:hAnsi="Times New Roman"/>
-          <w:b/>
-          <w:bCs/>
-          <w:sz w:val="40"/>
-          <w:szCs w:val="40"/>
-        </w:rPr>
+        <w:rPr/>
         <w:t>ACTIVIDAD 1</w:t>
       </w:r>
     </w:p>
@@ -224,22 +212,37 @@
               <w:spacing w:lineRule="auto" w:line="240" w:before="0" w:after="0"/>
               <w:jc w:val="start"/>
               <w:rPr>
-                <w:rFonts w:ascii="Times New Roman" w:hAnsi="Times New Roman"/>
+                <w:sz w:val="20"/>
+                <w:szCs w:val="20"/>
               </w:rPr>
             </w:pPr>
             <w:r>
               <w:rPr>
                 <w:rFonts w:eastAsia="Aptos" w:cs="" w:ascii="Times New Roman" w:hAnsi="Times New Roman"/>
-                <w:kern w:val="2"/>
-                <w:sz w:val="22"/>
-                <w:szCs w:val="22"/>
-                <w:lang w:val="es-ES" w:eastAsia="en-US" w:bidi="ar-SA"/>
-              </w:rPr>
-              <w:t>a) C</w:t>
-            </w:r>
-            <w:r>
-              <w:rPr>
-                <w:rFonts w:ascii="Times New Roman" w:hAnsi="Times New Roman"/>
+                <w:b/>
+                <w:bCs/>
+                <w:kern w:val="2"/>
+                <w:sz w:val="20"/>
+                <w:szCs w:val="20"/>
+                <w:lang w:val="es-ES" w:eastAsia="en-US" w:bidi="ar-SA"/>
+              </w:rPr>
+              <w:t>a)</w:t>
+            </w:r>
+            <w:r>
+              <w:rPr>
+                <w:rFonts w:eastAsia="Aptos" w:cs="" w:ascii="Times New Roman" w:hAnsi="Times New Roman"/>
+                <w:kern w:val="2"/>
+                <w:sz w:val="20"/>
+                <w:szCs w:val="20"/>
+                <w:lang w:val="es-ES" w:eastAsia="en-US" w:bidi="ar-SA"/>
+              </w:rPr>
+              <w:t xml:space="preserve"> C</w:t>
+            </w:r>
+            <w:r>
+              <w:rPr>
+                <w:rFonts w:ascii="Times New Roman" w:hAnsi="Times New Roman"/>
+                <w:sz w:val="20"/>
+                <w:szCs w:val="20"/>
               </w:rPr>
               <w:t>onjunto de actividades o acciones diseñadas para satisfacer una necesidad o un deseo del consumidor.</w:t>
             </w:r>
@@ -252,22 +255,37 @@
               <w:spacing w:lineRule="auto" w:line="240" w:before="0" w:after="0"/>
               <w:jc w:val="start"/>
               <w:rPr>
-                <w:rFonts w:ascii="Times New Roman" w:hAnsi="Times New Roman"/>
+                <w:sz w:val="20"/>
+                <w:szCs w:val="20"/>
               </w:rPr>
             </w:pPr>
             <w:r>
               <w:rPr>
                 <w:rFonts w:eastAsia="Aptos" w:cs="" w:ascii="Times New Roman" w:hAnsi="Times New Roman"/>
-                <w:kern w:val="2"/>
-                <w:sz w:val="22"/>
-                <w:szCs w:val="22"/>
-                <w:lang w:val="es-ES" w:eastAsia="en-US" w:bidi="ar-SA"/>
-              </w:rPr>
-              <w:t>b) S</w:t>
-            </w:r>
-            <w:r>
-              <w:rPr>
-                <w:rFonts w:ascii="Times New Roman" w:hAnsi="Times New Roman"/>
+                <w:b/>
+                <w:bCs/>
+                <w:kern w:val="2"/>
+                <w:sz w:val="20"/>
+                <w:szCs w:val="20"/>
+                <w:lang w:val="es-ES" w:eastAsia="en-US" w:bidi="ar-SA"/>
+              </w:rPr>
+              <w:t>b)</w:t>
+            </w:r>
+            <w:r>
+              <w:rPr>
+                <w:rFonts w:eastAsia="Aptos" w:cs="" w:ascii="Times New Roman" w:hAnsi="Times New Roman"/>
+                <w:kern w:val="2"/>
+                <w:sz w:val="20"/>
+                <w:szCs w:val="20"/>
+                <w:lang w:val="es-ES" w:eastAsia="en-US" w:bidi="ar-SA"/>
+              </w:rPr>
+              <w:t xml:space="preserve"> S</w:t>
+            </w:r>
+            <w:r>
+              <w:rPr>
+                <w:rFonts w:ascii="Times New Roman" w:hAnsi="Times New Roman"/>
+                <w:sz w:val="20"/>
+                <w:szCs w:val="20"/>
               </w:rPr>
               <w:t>ecuencia de pasos o actividades ordenadas que transforman unos elementos de entrada en un resultado o objetivo final.</w:t>
             </w:r>
@@ -284,8 +302,20 @@
             <w:r>
               <w:rPr>
                 <w:rFonts w:ascii="Times New Roman" w:hAnsi="Times New Roman"/>
-              </w:rPr>
-              <w:t xml:space="preserve">c) </w:t>
+                <w:b/>
+                <w:bCs/>
+                <w:sz w:val="20"/>
+                <w:szCs w:val="20"/>
+              </w:rPr>
+              <w:t>c)</w:t>
+            </w:r>
+            <w:r>
+              <w:rPr>
+                <w:rFonts w:ascii="Times New Roman" w:hAnsi="Times New Roman"/>
+                <w:sz w:val="20"/>
+                <w:szCs w:val="20"/>
+              </w:rPr>
+              <w:t xml:space="preserve"> </w:t>
             </w:r>
             <w:r>
               <w:rPr>
@@ -294,8 +324,8 @@
                 <w:bCs w:val="false"/>
                 <w:strike w:val="false"/>
                 <w:dstrike w:val="false"/>
-                <w:sz w:val="22"/>
-                <w:szCs w:val="22"/>
+                <w:sz w:val="20"/>
+                <w:szCs w:val="20"/>
                 <w:u w:val="none"/>
                 <w:effect w:val="none"/>
               </w:rPr>
@@ -309,8 +339,8 @@
                 <w:bCs w:val="false"/>
                 <w:strike w:val="false"/>
                 <w:dstrike w:val="false"/>
-                <w:sz w:val="22"/>
-                <w:szCs w:val="22"/>
+                <w:sz w:val="20"/>
+                <w:szCs w:val="20"/>
                 <w:u w:val="none"/>
                 <w:effect w:val="none"/>
               </w:rPr>
@@ -321,8 +351,8 @@
                 <w:rFonts w:ascii="Times New Roman" w:hAnsi="Times New Roman"/>
                 <w:b w:val="false"/>
                 <w:bCs w:val="false"/>
-                <w:sz w:val="22"/>
-                <w:szCs w:val="22"/>
+                <w:sz w:val="20"/>
+                <w:szCs w:val="20"/>
               </w:rPr>
               <w:t xml:space="preserve"> es la capacidad de un sistema para gestionar múltiples tareas que avanzan en periodos de tiempo solapados;  La </w:t>
             </w:r>
@@ -334,8 +364,8 @@
                 <w:bCs w:val="false"/>
                 <w:strike w:val="false"/>
                 <w:dstrike w:val="false"/>
-                <w:sz w:val="22"/>
-                <w:szCs w:val="22"/>
+                <w:sz w:val="20"/>
+                <w:szCs w:val="20"/>
                 <w:u w:val="none"/>
                 <w:effect w:val="none"/>
               </w:rPr>
@@ -346,8 +376,8 @@
                 <w:rFonts w:ascii="Times New Roman" w:hAnsi="Times New Roman"/>
                 <w:b w:val="false"/>
                 <w:bCs w:val="false"/>
-                <w:sz w:val="22"/>
-                <w:szCs w:val="22"/>
+                <w:sz w:val="20"/>
+                <w:szCs w:val="20"/>
               </w:rPr>
               <w:t xml:space="preserve"> es una forma concreta de lograr esa concurrencia utilizando múltiples hilos de ejecución dentro de un mismo proceso.</w:t>
             </w:r>
@@ -369,8 +399,8 @@
                 <w:bCs w:val="false"/>
                 <w:strike w:val="false"/>
                 <w:dstrike w:val="false"/>
-                <w:sz w:val="22"/>
-                <w:szCs w:val="22"/>
+                <w:sz w:val="20"/>
+                <w:szCs w:val="20"/>
                 <w:u w:val="none"/>
                 <w:effect w:val="none"/>
               </w:rPr>
@@ -381,8 +411,8 @@
                 <w:rFonts w:ascii="Times New Roman" w:hAnsi="Times New Roman"/>
                 <w:b w:val="false"/>
                 <w:bCs w:val="false"/>
-                <w:sz w:val="22"/>
-                <w:szCs w:val="22"/>
+                <w:sz w:val="20"/>
+                <w:szCs w:val="20"/>
               </w:rPr>
               <w:t xml:space="preserve">, sino que la programación multihilo es una herramienta (o un modelo) para implementar la concurrencia </w:t>
             </w:r>
@@ -391,6 +421,8 @@
                 <w:rFonts w:ascii="Times New Roman" w:hAnsi="Times New Roman"/>
                 <w:b w:val="false"/>
                 <w:bCs w:val="false"/>
+                <w:sz w:val="20"/>
+                <w:szCs w:val="20"/>
               </w:rPr>
               <w:t xml:space="preserve"> </w:t>
             </w:r>
@@ -579,19 +611,14 @@
     </w:tbl>
     <w:p>
       <w:pPr>
-        <w:pStyle w:val="Subtitle"/>
-        <w:spacing w:lineRule="auto" w:line="240"/>
+        <w:pStyle w:val="Title"/>
         <w:jc w:val="center"/>
-        <w:rPr>
-          <w:rFonts w:ascii="Calibri" w:hAnsi="Calibri" w:cs="Calibri"/>
-          <w:sz w:val="40"/>
-          <w:szCs w:val="40"/>
-        </w:rPr>
+        <w:rPr/>
       </w:pPr>
       <w:r/>
       <w:r>
         <w:rPr>
-          <w:rFonts w:cs="Calibri" w:ascii="Times New Roman" w:hAnsi="Times New Roman"/>
+          <w:rFonts w:cs="Calibri"/>
           <w:b/>
           <w:bCs/>
           <w:sz w:val="40"/>
@@ -601,20 +628,34 @@
       </w:r>
       <w:r>
         <w:rPr>
-          <w:rFonts w:cs="Calibri" w:ascii="Calibri" w:hAnsi="Calibri"/>
+          <w:rFonts w:cs="Calibri"/>
+          <w:b/>
+          <w:bCs/>
           <w:sz w:val="40"/>
           <w:szCs w:val="40"/>
         </w:rPr>
-        <w:t xml:space="preserve">S </w:t>
+        <w:t>S</w:t>
+      </w:r>
+      <w:r>
+        <w:rPr>
+          <w:rFonts w:cs="Calibri"/>
+          <w:sz w:val="40"/>
+          <w:szCs w:val="40"/>
+        </w:rPr>
+        <w:t xml:space="preserve"> </w:t>
       </w:r>
     </w:p>
     <w:p>
       <w:pPr>
         <w:pStyle w:val="Normal"/>
-        <w:rPr/>
+        <w:rPr>
+          <w:rFonts w:ascii="Times New Roman" w:hAnsi="Times New Roman"/>
+        </w:rPr>
       </w:pPr>
       <w:r>
-        <w:rPr/>
+        <w:rPr>
+          <w:rFonts w:ascii="Times New Roman" w:hAnsi="Times New Roman"/>
+        </w:rPr>
       </w:r>
     </w:p>
     <w:p>
@@ -622,8 +663,6 @@
         <w:pStyle w:val="Normal"/>
         <w:rPr>
           <w:rFonts w:ascii="Times New Roman" w:hAnsi="Times New Roman"/>
-          <w:sz w:val="22"/>
-          <w:szCs w:val="22"/>
         </w:rPr>
       </w:pPr>
       <w:r>
@@ -712,11 +751,7 @@
               <w:spacing w:lineRule="auto" w:line="240" w:before="0" w:after="0"/>
               <w:jc w:val="start"/>
               <w:rPr>
-                <w:rFonts w:ascii="Times New Roman" w:hAnsi="Times New Roman" w:eastAsia="Aptos" w:cs=""/>
-                <w:kern w:val="2"/>
-                <w:sz w:val="22"/>
-                <w:szCs w:val="22"/>
-                <w:lang w:val="es-ES" w:eastAsia="en-US" w:bidi="ar-SA"/>
+                <w:rFonts w:ascii="Times New Roman" w:hAnsi="Times New Roman"/>
               </w:rPr>
             </w:pPr>
             <w:r>
@@ -754,11 +789,7 @@
               <w:contextualSpacing/>
               <w:jc w:val="start"/>
               <w:rPr>
-                <w:rFonts w:ascii="Times New Roman" w:hAnsi="Times New Roman" w:eastAsia="Aptos" w:cs=""/>
-                <w:kern w:val="2"/>
-                <w:sz w:val="22"/>
-                <w:szCs w:val="22"/>
-                <w:lang w:val="es-ES" w:eastAsia="en-US" w:bidi="ar-SA"/>
+                <w:rFonts w:ascii="Times New Roman" w:hAnsi="Times New Roman"/>
               </w:rPr>
             </w:pPr>
             <w:r>
@@ -785,11 +816,7 @@
               <w:contextualSpacing/>
               <w:jc w:val="start"/>
               <w:rPr>
-                <w:rFonts w:ascii="Times New Roman" w:hAnsi="Times New Roman" w:eastAsia="Aptos" w:cs=""/>
-                <w:kern w:val="2"/>
-                <w:sz w:val="22"/>
-                <w:szCs w:val="22"/>
-                <w:lang w:val="es-ES" w:eastAsia="en-US" w:bidi="ar-SA"/>
+                <w:rFonts w:ascii="Times New Roman" w:hAnsi="Times New Roman"/>
               </w:rPr>
             </w:pPr>
             <w:r>
@@ -820,22 +847,50 @@
               <w:spacing w:lineRule="auto" w:line="240" w:before="0" w:after="0"/>
               <w:jc w:val="start"/>
               <w:rPr>
-                <w:rFonts w:ascii="Times New Roman" w:hAnsi="Times New Roman" w:eastAsia="Aptos" w:cs=""/>
+                <w:rFonts w:ascii="Times New Roman" w:hAnsi="Times New Roman"/>
+              </w:rPr>
+            </w:pPr>
+            <w:r>
+              <w:rPr>
+                <w:rFonts w:eastAsia="Aptos" w:cs="" w:ascii="Times New Roman" w:hAnsi="Times New Roman"/>
                 <w:kern w:val="2"/>
                 <w:sz w:val="22"/>
                 <w:szCs w:val="22"/>
                 <w:lang w:val="es-ES" w:eastAsia="en-US" w:bidi="ar-SA"/>
               </w:rPr>
+              <w:t>RESPUESTAS:</w:t>
+            </w:r>
+          </w:p>
+          <w:p>
+            <w:pPr>
+              <w:pStyle w:val="Normal"/>
+              <w:widowControl/>
+              <w:suppressAutoHyphens w:val="true"/>
+              <w:spacing w:lineRule="auto" w:line="240" w:before="0" w:after="0"/>
+              <w:jc w:val="start"/>
+              <w:rPr>
+                <w:rFonts w:ascii="Times New Roman" w:hAnsi="Times New Roman"/>
+                <w:sz w:val="20"/>
+                <w:szCs w:val="20"/>
+              </w:rPr>
             </w:pPr>
             <w:r>
               <w:rPr>
                 <w:rFonts w:eastAsia="Aptos" w:cs="" w:ascii="Times New Roman" w:hAnsi="Times New Roman"/>
                 <w:kern w:val="2"/>
-                <w:sz w:val="22"/>
-                <w:szCs w:val="22"/>
-                <w:lang w:val="es-ES" w:eastAsia="en-US" w:bidi="ar-SA"/>
-              </w:rPr>
-              <w:t>RESPUESTAS:</w:t>
+                <w:sz w:val="20"/>
+                <w:szCs w:val="20"/>
+                <w:lang w:val="es-ES" w:eastAsia="en-US" w:bidi="ar-SA"/>
+              </w:rPr>
+              <w:t xml:space="preserve">a) La la criptografía es </w:t>
+            </w:r>
+            <w:r>
+              <w:rPr>
+                <w:rFonts w:ascii="Times New Roman" w:hAnsi="Times New Roman"/>
+                <w:sz w:val="20"/>
+                <w:szCs w:val="20"/>
+              </w:rPr>
+              <w:t>ciencia y el arte de proteger la información transformándola mediante algoritmos matemáticos para que solo puedan leerla las personas autorizadas.</w:t>
             </w:r>
           </w:p>
           <w:p>
@@ -849,30 +904,10 @@
             </w:pPr>
             <w:r>
               <w:rPr>
-                <w:rFonts w:eastAsia="Aptos" w:cs="" w:ascii="Times New Roman" w:hAnsi="Times New Roman"/>
-                <w:kern w:val="2"/>
-                <w:sz w:val="22"/>
-                <w:szCs w:val="22"/>
-                <w:lang w:val="es-ES" w:eastAsia="en-US" w:bidi="ar-SA"/>
-              </w:rPr>
-              <w:t xml:space="preserve">a) La la criptografía es </w:t>
-            </w:r>
-            <w:r>
-              <w:rPr/>
-              <w:t>ciencia y el arte de proteger la información transformándola mediante algoritmos matemáticos para que solo puedan leerla las personas autorizadas.</w:t>
-            </w:r>
-          </w:p>
-          <w:p>
-            <w:pPr>
-              <w:pStyle w:val="Normal"/>
-              <w:widowControl/>
-              <w:suppressAutoHyphens w:val="true"/>
-              <w:spacing w:lineRule="auto" w:line="240" w:before="0" w:after="0"/>
-              <w:jc w:val="start"/>
-              <w:rPr/>
-            </w:pPr>
-            <w:r>
-              <w:rPr/>
+                <w:rFonts w:ascii="Times New Roman" w:hAnsi="Times New Roman"/>
+                <w:sz w:val="20"/>
+                <w:szCs w:val="20"/>
+              </w:rPr>
               <w:t xml:space="preserve">b) </w:t>
             </w:r>
             <w:r>
@@ -882,8 +917,8 @@
                 <w:bCs w:val="false"/>
                 <w:strike w:val="false"/>
                 <w:dstrike w:val="false"/>
-                <w:sz w:val="22"/>
-                <w:szCs w:val="22"/>
+                <w:sz w:val="20"/>
+                <w:szCs w:val="20"/>
                 <w:u w:val="none"/>
                 <w:effect w:val="none"/>
               </w:rPr>
@@ -897,8 +932,8 @@
                 <w:bCs w:val="false"/>
                 <w:strike w:val="false"/>
                 <w:dstrike w:val="false"/>
-                <w:sz w:val="22"/>
-                <w:szCs w:val="22"/>
+                <w:sz w:val="20"/>
+                <w:szCs w:val="20"/>
                 <w:u w:val="none"/>
                 <w:effect w:val="none"/>
               </w:rPr>
@@ -909,13 +944,15 @@
                 <w:rFonts w:ascii="Times New Roman" w:hAnsi="Times New Roman"/>
                 <w:b w:val="false"/>
                 <w:bCs w:val="false"/>
-                <w:sz w:val="22"/>
-                <w:szCs w:val="22"/>
+                <w:sz w:val="20"/>
+                <w:szCs w:val="20"/>
               </w:rPr>
               <w:t xml:space="preserve"> es un término informático que se refiere principalmente a un conector físico para el procesador en una computadora o a un punto de conexión lógico para la comunicación de datos en una red</w:t>
             </w:r>
             <w:r>
-              <w:rPr/>
+              <w:rPr>
+                <w:rFonts w:ascii="Times New Roman" w:hAnsi="Times New Roman"/>
+              </w:rPr>
               <w:t xml:space="preserve"> </w:t>
             </w:r>
           </w:p>
@@ -936,11 +973,7 @@
               <w:spacing w:lineRule="auto" w:line="240" w:before="0" w:after="0"/>
               <w:jc w:val="start"/>
               <w:rPr>
-                <w:rFonts w:ascii="Times New Roman" w:hAnsi="Times New Roman" w:eastAsia="Aptos" w:cs=""/>
-                <w:kern w:val="2"/>
-                <w:sz w:val="22"/>
-                <w:szCs w:val="22"/>
-                <w:lang w:val="es-ES" w:eastAsia="en-US" w:bidi="ar-SA"/>
+                <w:rFonts w:ascii="Times New Roman" w:hAnsi="Times New Roman"/>
               </w:rPr>
             </w:pPr>
             <w:r>
@@ -962,13 +995,7 @@
               <w:bidi w:val="0"/>
               <w:spacing w:lineRule="auto" w:line="240" w:before="0" w:after="0"/>
               <w:jc w:val="start"/>
-              <w:rPr>
-                <w:rFonts w:ascii="Times New Roman" w:hAnsi="Times New Roman" w:eastAsia="Aptos" w:cs=""/>
-                <w:kern w:val="2"/>
-                <w:sz w:val="22"/>
-                <w:szCs w:val="22"/>
-                <w:lang w:val="es-ES" w:eastAsia="en-US" w:bidi="ar-SA"/>
-              </w:rPr>
+              <w:rPr/>
             </w:pPr>
             <w:hyperlink r:id="rId5">
               <w:r>
@@ -992,13 +1019,7 @@
               <w:bidi w:val="0"/>
               <w:spacing w:lineRule="auto" w:line="240" w:before="0" w:after="0"/>
               <w:jc w:val="start"/>
-              <w:rPr>
-                <w:rFonts w:ascii="Times New Roman" w:hAnsi="Times New Roman" w:eastAsia="Aptos" w:cs=""/>
-                <w:kern w:val="2"/>
-                <w:sz w:val="22"/>
-                <w:szCs w:val="22"/>
-                <w:lang w:val="es-ES" w:eastAsia="en-US" w:bidi="ar-SA"/>
-              </w:rPr>
+              <w:rPr/>
             </w:pPr>
             <w:hyperlink r:id="rId6">
               <w:r>
@@ -1022,39 +1043,7 @@
               <w:bidi w:val="0"/>
               <w:spacing w:lineRule="auto" w:line="240" w:before="0" w:after="0"/>
               <w:jc w:val="start"/>
-              <w:rPr>
-                <w:rFonts w:ascii="Times New Roman" w:hAnsi="Times New Roman" w:eastAsia="Aptos" w:cs=""/>
-                <w:kern w:val="2"/>
-                <w:sz w:val="22"/>
-                <w:szCs w:val="22"/>
-                <w:lang w:val="es-ES" w:eastAsia="en-US" w:bidi="ar-SA"/>
-              </w:rPr>
-            </w:pPr>
-            <w:r>
-              <w:rPr>
-                <w:rFonts w:eastAsia="Aptos" w:cs="" w:ascii="Times New Roman" w:hAnsi="Times New Roman"/>
-                <w:kern w:val="2"/>
-                <w:sz w:val="22"/>
-                <w:szCs w:val="22"/>
-                <w:lang w:val="es-ES" w:eastAsia="en-US" w:bidi="ar-SA"/>
-              </w:rPr>
-            </w:r>
-          </w:p>
-          <w:p>
-            <w:pPr>
-              <w:pStyle w:val="Normal"/>
-              <w:widowControl/>
-              <w:suppressAutoHyphens w:val="true"/>
-              <w:bidi w:val="0"/>
-              <w:spacing w:lineRule="auto" w:line="240" w:before="0" w:after="0"/>
-              <w:jc w:val="start"/>
-              <w:rPr>
-                <w:rFonts w:ascii="Times New Roman" w:hAnsi="Times New Roman" w:eastAsia="Aptos" w:cs=""/>
-                <w:kern w:val="2"/>
-                <w:sz w:val="22"/>
-                <w:szCs w:val="22"/>
-                <w:lang w:val="es-ES" w:eastAsia="en-US" w:bidi="ar-SA"/>
-              </w:rPr>
+              <w:rPr/>
             </w:pPr>
             <w:hyperlink r:id="rId7">
               <w:r>
@@ -1079,11 +1068,7 @@
               <w:spacing w:lineRule="auto" w:line="240" w:before="0" w:after="0"/>
               <w:jc w:val="start"/>
               <w:rPr>
-                <w:rFonts w:ascii="Times New Roman" w:hAnsi="Times New Roman" w:eastAsia="Aptos" w:cs=""/>
-                <w:kern w:val="2"/>
-                <w:sz w:val="22"/>
-                <w:szCs w:val="22"/>
-                <w:lang w:val="es-ES" w:eastAsia="en-US" w:bidi="ar-SA"/>
+                <w:rFonts w:ascii="Times New Roman" w:hAnsi="Times New Roman"/>
               </w:rPr>
             </w:pPr>
             <w:r>
@@ -1125,6 +1110,23 @@
         </w:tc>
       </w:tr>
     </w:tbl>
+    <w:p>
+      <w:pPr>
+        <w:pStyle w:val="Normal"/>
+        <w:rPr>
+          <w:rFonts w:ascii="Times New Roman" w:hAnsi="Times New Roman"/>
+          <w:sz w:val="22"/>
+          <w:szCs w:val="22"/>
+        </w:rPr>
+      </w:pPr>
+      <w:r>
+        <w:rPr>
+          <w:rFonts w:ascii="Times New Roman" w:hAnsi="Times New Roman"/>
+          <w:sz w:val="22"/>
+          <w:szCs w:val="22"/>
+        </w:rPr>
+      </w:r>
+    </w:p>
     <w:p>
       <w:pPr>
         <w:pStyle w:val="Normal"/>
@@ -1226,11 +1228,7 @@
               <w:spacing w:lineRule="auto" w:line="240" w:before="0" w:after="0"/>
               <w:jc w:val="start"/>
               <w:rPr>
-                <w:rFonts w:ascii="Times New Roman" w:hAnsi="Times New Roman" w:eastAsia="Aptos" w:cs=""/>
-                <w:kern w:val="2"/>
-                <w:sz w:val="22"/>
-                <w:szCs w:val="22"/>
-                <w:lang w:val="es-ES" w:eastAsia="en-US" w:bidi="ar-SA"/>
+                <w:rFonts w:ascii="Times New Roman" w:hAnsi="Times New Roman"/>
               </w:rPr>
             </w:pPr>
             <w:r>
@@ -1268,11 +1266,7 @@
               <w:contextualSpacing/>
               <w:jc w:val="start"/>
               <w:rPr>
-                <w:rFonts w:ascii="Times New Roman" w:hAnsi="Times New Roman" w:eastAsia="Aptos" w:cs=""/>
-                <w:kern w:val="2"/>
-                <w:sz w:val="22"/>
-                <w:szCs w:val="22"/>
-                <w:lang w:val="es-ES" w:eastAsia="en-US" w:bidi="ar-SA"/>
+                <w:rFonts w:ascii="Times New Roman" w:hAnsi="Times New Roman"/>
               </w:rPr>
             </w:pPr>
             <w:r>
@@ -1319,6 +1313,31 @@
                 <w:lang w:val="es-ES" w:eastAsia="en-US" w:bidi="ar-SA"/>
               </w:rPr>
               <w:t>RESPUESTA:</w:t>
+            </w:r>
+          </w:p>
+          <w:p>
+            <w:pPr>
+              <w:pStyle w:val="Normal"/>
+              <w:widowControl/>
+              <w:suppressAutoHyphens w:val="true"/>
+              <w:spacing w:lineRule="auto" w:line="240" w:before="0" w:after="0"/>
+              <w:jc w:val="start"/>
+              <w:rPr>
+                <w:rFonts w:ascii="Times New Roman" w:hAnsi="Times New Roman" w:eastAsia="Aptos" w:cs=""/>
+                <w:kern w:val="2"/>
+                <w:sz w:val="22"/>
+                <w:szCs w:val="22"/>
+                <w:lang w:val="es-ES" w:eastAsia="en-US" w:bidi="ar-SA"/>
+              </w:rPr>
+            </w:pPr>
+            <w:r>
+              <w:rPr>
+                <w:rFonts w:eastAsia="Aptos" w:cs="" w:ascii="Times New Roman" w:hAnsi="Times New Roman"/>
+                <w:kern w:val="2"/>
+                <w:sz w:val="22"/>
+                <w:szCs w:val="22"/>
+                <w:lang w:val="es-ES" w:eastAsia="en-US" w:bidi="ar-SA"/>
+              </w:rPr>
             </w:r>
           </w:p>
           <w:p>
@@ -1485,7 +1504,7 @@
                 <w:u w:val="none"/>
                 <w:effect w:val="none"/>
               </w:rPr>
-              <w:t>). Es una entidad pasiva: no hace nada por sí mismo hasta que se decide ejecutar</w:t>
+              <w:t>). Es una entidad pasiva: no hace nada por sí mismo hasta que se decide ejecutar.</w:t>
             </w:r>
           </w:p>
           <w:p>
@@ -1661,7 +1680,7 @@
                 <w:u w:val="none"/>
                 <w:effect w:val="none"/>
               </w:rPr>
-              <w:t>. Cuando el sistema operativo carga un programa en la memoria RAM y le asigna recursos (espacio de dirección de memoria, archivos abiertos, variables), el programa cobra vida y se convierte en un proceso. Es una entidad activa</w:t>
+              <w:t>. Cuando el sistema operativo carga un programa en la memoria RAM y le asigna recursos (espacio de dirección de memoria, archivos abiertos, variables), el programa cobra vida y se convierte en un proceso. Es una entidad activa.</w:t>
             </w:r>
           </w:p>
           <w:p>
@@ -1868,7 +1887,7 @@
                 <w:u w:val="none"/>
                 <w:effect w:val="none"/>
               </w:rPr>
-              <w:t xml:space="preserve"> dentro de un proceso (también conocido como "proceso ligero"). Representa una secuencia de instrucciones que el procesador puede ejecutar de forma independiente. Un proceso puede contener uno o varios hilos</w:t>
+              <w:t xml:space="preserve"> dentro de un proceso (también conocido como "proceso ligero"). Representa una secuencia de instrucciones que el procesador puede ejecutar de forma independiente. Un proceso puede contener uno o varios hilos.</w:t>
             </w:r>
           </w:p>
           <w:p>
@@ -1917,12 +1936,12 @@
               <w:ind w:hanging="0" w:start="0" w:end="0"/>
               <w:rPr>
                 <w:rFonts w:ascii="Times New Roman" w:hAnsi="Times New Roman"/>
-                <w:b w:val="false"/>
-                <w:bCs w:val="false"/>
+                <w:b/>
+                <w:bCs/>
                 <w:strike w:val="false"/>
                 <w:dstrike w:val="false"/>
-                <w:sz w:val="20"/>
-                <w:szCs w:val="20"/>
+                <w:sz w:val="24"/>
+                <w:szCs w:val="24"/>
                 <w:u w:val="none"/>
                 <w:effect w:val="none"/>
               </w:rPr>
@@ -1930,12 +1949,12 @@
             <w:r>
               <w:rPr>
                 <w:rFonts w:ascii="Times New Roman" w:hAnsi="Times New Roman"/>
-                <w:b w:val="false"/>
-                <w:bCs w:val="false"/>
+                <w:b/>
+                <w:bCs/>
                 <w:strike w:val="false"/>
                 <w:dstrike w:val="false"/>
-                <w:sz w:val="20"/>
-                <w:szCs w:val="20"/>
+                <w:sz w:val="24"/>
+                <w:szCs w:val="24"/>
                 <w:u w:val="none"/>
                 <w:effect w:val="none"/>
               </w:rPr>
@@ -1944,12 +1963,12 @@
             <w:r>
               <w:rPr>
                 <w:rFonts w:ascii="Times New Roman" w:hAnsi="Times New Roman"/>
-                <w:b w:val="false"/>
-                <w:bCs w:val="false"/>
+                <w:b/>
+                <w:bCs/>
                 <w:strike w:val="false"/>
                 <w:dstrike w:val="false"/>
-                <w:sz w:val="20"/>
-                <w:szCs w:val="20"/>
+                <w:sz w:val="24"/>
+                <w:szCs w:val="24"/>
                 <w:u w:val="none"/>
                 <w:effect w:val="none"/>
               </w:rPr>
@@ -1958,12 +1977,12 @@
             <w:r>
               <w:rPr>
                 <w:rFonts w:ascii="Times New Roman" w:hAnsi="Times New Roman"/>
-                <w:b w:val="false"/>
-                <w:bCs w:val="false"/>
+                <w:b/>
+                <w:bCs/>
                 <w:strike w:val="false"/>
                 <w:dstrike w:val="false"/>
-                <w:sz w:val="20"/>
-                <w:szCs w:val="20"/>
+                <w:sz w:val="24"/>
+                <w:szCs w:val="24"/>
                 <w:u w:val="none"/>
                 <w:effect w:val="none"/>
               </w:rPr>
@@ -2309,17 +2328,7 @@
                 <w:u w:val="none"/>
                 <w:effect w:val="none"/>
               </w:rPr>
-              <w:t xml:space="preserve"> Todos los hilos de un mismo proceso comparten su memoria, variables y archivos. Sin embargo, cada hilo mantiene su propio contador, registros y pila de forma individual</w:t>
-            </w:r>
-            <w:r>
-              <w:rPr>
-                <w:rFonts w:ascii="Times New Roman" w:hAnsi="Times New Roman"/>
-                <w:b w:val="false"/>
-                <w:bCs w:val="false"/>
-                <w:sz w:val="20"/>
-                <w:szCs w:val="20"/>
-              </w:rPr>
-              <w:t xml:space="preserve"> </w:t>
+              <w:t xml:space="preserve"> Todos los hilos de un mismo proceso comparten su memoria, variables y archivos. Sin embargo, cada hilo mantiene su propio contador, registros y pila de forma individual.</w:t>
             </w:r>
           </w:p>
           <w:p>
@@ -2330,7 +2339,7 @@
               <w:spacing w:lineRule="auto" w:line="240" w:before="0" w:after="0"/>
               <w:ind w:hanging="0" w:start="0" w:end="0"/>
               <w:rPr>
-                <w:rFonts w:ascii="Google Sans;Arial;sans-serif;Noto Color Emoji" w:hAnsi="Google Sans;Arial;sans-serif;Noto Color Emoji"/>
+                <w:rFonts w:ascii="Times New Roman" w:hAnsi="Times New Roman"/>
                 <w:b w:val="false"/>
                 <w:strike w:val="false"/>
                 <w:dstrike w:val="false"/>
@@ -2341,7 +2350,7 @@
             </w:pPr>
             <w:r>
               <w:rPr>
-                <w:rFonts w:ascii="Google Sans;Arial;sans-serif;Noto Color Emoji" w:hAnsi="Google Sans;Arial;sans-serif;Noto Color Emoji"/>
+                <w:rFonts w:ascii="Times New Roman" w:hAnsi="Times New Roman"/>
                 <w:b w:val="false"/>
                 <w:strike w:val="false"/>
                 <w:dstrike w:val="false"/>
@@ -2393,11 +2402,7 @@
               <w:spacing w:lineRule="auto" w:line="240" w:before="0" w:after="0"/>
               <w:jc w:val="start"/>
               <w:rPr>
-                <w:rFonts w:ascii="Times New Roman" w:hAnsi="Times New Roman" w:eastAsia="Aptos" w:cs=""/>
-                <w:kern w:val="2"/>
-                <w:sz w:val="22"/>
-                <w:szCs w:val="22"/>
-                <w:lang w:val="es-ES" w:eastAsia="en-US" w:bidi="ar-SA"/>
+                <w:rFonts w:ascii="Times New Roman" w:hAnsi="Times New Roman"/>
               </w:rPr>
             </w:pPr>
             <w:r>
@@ -2550,11 +2555,7 @@
               <w:spacing w:lineRule="auto" w:line="240" w:before="0" w:after="0"/>
               <w:jc w:val="start"/>
               <w:rPr>
-                <w:rFonts w:ascii="Times New Roman" w:hAnsi="Times New Roman" w:eastAsia="Aptos" w:cs=""/>
-                <w:kern w:val="2"/>
-                <w:sz w:val="22"/>
-                <w:szCs w:val="22"/>
-                <w:lang w:val="es-ES" w:eastAsia="en-US" w:bidi="ar-SA"/>
+                <w:rFonts w:ascii="Times New Roman" w:hAnsi="Times New Roman"/>
               </w:rPr>
             </w:pPr>
             <w:r>
@@ -2592,11 +2593,7 @@
               <w:contextualSpacing/>
               <w:jc w:val="start"/>
               <w:rPr>
-                <w:rFonts w:ascii="Times New Roman" w:hAnsi="Times New Roman" w:eastAsia="Aptos" w:cs=""/>
-                <w:kern w:val="2"/>
-                <w:sz w:val="22"/>
-                <w:szCs w:val="22"/>
-                <w:lang w:val="es-ES" w:eastAsia="en-US" w:bidi="ar-SA"/>
+                <w:rFonts w:ascii="Times New Roman" w:hAnsi="Times New Roman"/>
               </w:rPr>
             </w:pPr>
             <w:r>
@@ -2623,11 +2620,7 @@
               <w:contextualSpacing/>
               <w:jc w:val="start"/>
               <w:rPr>
-                <w:rFonts w:ascii="Times New Roman" w:hAnsi="Times New Roman" w:eastAsia="Aptos" w:cs=""/>
-                <w:kern w:val="2"/>
-                <w:sz w:val="22"/>
-                <w:szCs w:val="22"/>
-                <w:lang w:val="es-ES" w:eastAsia="en-US" w:bidi="ar-SA"/>
+                <w:rFonts w:ascii="Times New Roman" w:hAnsi="Times New Roman"/>
               </w:rPr>
             </w:pPr>
             <w:r>
@@ -2654,11 +2647,7 @@
               <w:contextualSpacing/>
               <w:jc w:val="start"/>
               <w:rPr>
-                <w:rFonts w:ascii="Times New Roman" w:hAnsi="Times New Roman" w:eastAsia="Aptos" w:cs=""/>
-                <w:kern w:val="2"/>
-                <w:sz w:val="22"/>
-                <w:szCs w:val="22"/>
-                <w:lang w:val="es-ES" w:eastAsia="en-US" w:bidi="ar-SA"/>
+                <w:rFonts w:ascii="Times New Roman" w:hAnsi="Times New Roman"/>
               </w:rPr>
             </w:pPr>
             <w:r>
@@ -2685,11 +2674,7 @@
               <w:contextualSpacing/>
               <w:jc w:val="start"/>
               <w:rPr>
-                <w:rFonts w:ascii="Times New Roman" w:hAnsi="Times New Roman" w:eastAsia="Aptos" w:cs=""/>
-                <w:kern w:val="2"/>
-                <w:sz w:val="22"/>
-                <w:szCs w:val="22"/>
-                <w:lang w:val="es-ES" w:eastAsia="en-US" w:bidi="ar-SA"/>
+                <w:rFonts w:ascii="Times New Roman" w:hAnsi="Times New Roman"/>
               </w:rPr>
             </w:pPr>
             <w:r>
@@ -2716,11 +2701,7 @@
               <w:contextualSpacing/>
               <w:jc w:val="start"/>
               <w:rPr>
-                <w:rFonts w:ascii="Times New Roman" w:hAnsi="Times New Roman" w:eastAsia="Aptos" w:cs=""/>
-                <w:kern w:val="2"/>
-                <w:sz w:val="22"/>
-                <w:szCs w:val="22"/>
-                <w:lang w:val="es-ES" w:eastAsia="en-US" w:bidi="ar-SA"/>
+                <w:rFonts w:ascii="Times New Roman" w:hAnsi="Times New Roman"/>
               </w:rPr>
             </w:pPr>
             <w:r>
@@ -2812,7 +2793,7 @@
                 <w:szCs w:val="20"/>
                 <w:lang w:val="es-ES" w:eastAsia="en-US" w:bidi="ar-SA"/>
               </w:rPr>
-              <w:t xml:space="preserve">modelo de desarrollo que permite ejecutar múltiples tareas o procesos de forma simultánea o intercalada </w:t>
+              <w:t>modelo de desarrollo que permite ejecutar múltiples tareas o procesos de forma simultánea o intercalada.</w:t>
             </w:r>
           </w:p>
           <w:p>
@@ -2902,7 +2883,7 @@
                 <w:szCs w:val="20"/>
                 <w:lang w:val="es-ES" w:eastAsia="en-US" w:bidi="ar-SA"/>
               </w:rPr>
-              <w:t xml:space="preserve"> en diferentes procesadores o núcleos de cómputo </w:t>
+              <w:t xml:space="preserve"> en diferentes procesadores o núcleos de cómputo.</w:t>
             </w:r>
           </w:p>
           <w:p>
@@ -2928,11 +2909,13 @@
             </w:r>
             <w:r>
               <w:rPr>
-                <w:rFonts w:ascii="Google Sans;Arial;sans-serif;Noto Color Emoji" w:hAnsi="Google Sans;Arial;sans-serif;Noto Color Emoji"/>
+                <w:rFonts w:ascii="Times New Roman" w:hAnsi="Times New Roman"/>
                 <w:b w:val="false"/>
+                <w:bCs w:val="false"/>
                 <w:strike w:val="false"/>
                 <w:dstrike w:val="false"/>
-                <w:sz w:val="24"/>
+                <w:sz w:val="20"/>
+                <w:szCs w:val="20"/>
                 <w:u w:val="none"/>
                 <w:effect w:val="none"/>
               </w:rPr>
@@ -2941,36 +2924,62 @@
             <w:r>
               <w:rPr>
                 <w:rStyle w:val="Strong"/>
-                <w:rFonts w:ascii="Google Sans;Arial;sans-serif;Noto Color Emoji" w:hAnsi="Google Sans;Arial;sans-serif;Noto Color Emoji"/>
-                <w:b/>
+                <w:rFonts w:ascii="Times New Roman" w:hAnsi="Times New Roman"/>
+                <w:b w:val="false"/>
+                <w:bCs w:val="false"/>
                 <w:strike w:val="false"/>
                 <w:dstrike w:val="false"/>
-                <w:sz w:val="24"/>
+                <w:sz w:val="20"/>
+                <w:szCs w:val="20"/>
                 <w:u w:val="none"/>
                 <w:effect w:val="none"/>
               </w:rPr>
               <w:t>programación distribuida</w:t>
             </w:r>
             <w:r>
-              <w:rPr/>
+              <w:rPr>
+                <w:rFonts w:ascii="Times New Roman" w:hAnsi="Times New Roman"/>
+                <w:b w:val="false"/>
+                <w:bCs w:val="false"/>
+                <w:sz w:val="20"/>
+                <w:szCs w:val="20"/>
+              </w:rPr>
               <w:t xml:space="preserve"> es un paradigma de desarrollo de software en el que un programa se divide en varias partes que se ejecutan simultáneamente en </w:t>
             </w:r>
             <w:r>
               <w:rPr>
                 <w:rStyle w:val="Strong"/>
-                <w:rFonts w:ascii="Google Sans;Arial;sans-serif;Noto Color Emoji" w:hAnsi="Google Sans;Arial;sans-serif;Noto Color Emoji"/>
-                <w:b/>
+                <w:rFonts w:ascii="Times New Roman" w:hAnsi="Times New Roman"/>
+                <w:b w:val="false"/>
+                <w:bCs w:val="false"/>
                 <w:strike w:val="false"/>
                 <w:dstrike w:val="false"/>
-                <w:sz w:val="24"/>
+                <w:sz w:val="20"/>
+                <w:szCs w:val="20"/>
                 <w:u w:val="none"/>
                 <w:effect w:val="none"/>
               </w:rPr>
               <w:t>múltiples ordenadores o nodos</w:t>
             </w:r>
             <w:r>
-              <w:rPr/>
-              <w:t xml:space="preserve"> conectados a través de una red, trabajando juntos para cumplir un objetivo común </w:t>
+              <w:rPr>
+                <w:rFonts w:ascii="Times New Roman" w:hAnsi="Times New Roman"/>
+                <w:b w:val="false"/>
+                <w:bCs w:val="false"/>
+                <w:sz w:val="20"/>
+                <w:szCs w:val="20"/>
+              </w:rPr>
+              <w:t xml:space="preserve"> conect</w:t>
+            </w:r>
+            <w:r>
+              <w:rPr>
+                <w:rFonts w:ascii="Times New Roman" w:hAnsi="Times New Roman"/>
+                <w:b w:val="false"/>
+                <w:bCs w:val="false"/>
+                <w:sz w:val="20"/>
+                <w:szCs w:val="20"/>
+              </w:rPr>
+              <w:t>ados a través de una red, trabajando juntos para cumplir un objetivo común.</w:t>
             </w:r>
           </w:p>
           <w:p>
@@ -2980,11 +2989,14 @@
               <w:suppressAutoHyphens w:val="true"/>
               <w:spacing w:lineRule="auto" w:line="240" w:before="0" w:after="0"/>
               <w:jc w:val="start"/>
-              <w:rPr/>
-            </w:pPr>
-            <w:r>
-              <w:rPr/>
-              <w:t xml:space="preserve">- </w:t>
+              <w:rPr>
+                <w:rFonts w:ascii="Times New Roman" w:hAnsi="Times New Roman"/>
+              </w:rPr>
+            </w:pPr>
+            <w:r>
+              <w:rPr>
+                <w:rFonts w:ascii="Times New Roman" w:hAnsi="Times New Roman"/>
+              </w:rPr>
             </w:r>
           </w:p>
         </w:tc>
@@ -3004,11 +3016,7 @@
               <w:spacing w:lineRule="auto" w:line="240" w:before="0" w:after="0"/>
               <w:jc w:val="start"/>
               <w:rPr>
-                <w:rFonts w:ascii="Times New Roman" w:hAnsi="Times New Roman" w:eastAsia="Aptos" w:cs=""/>
-                <w:kern w:val="2"/>
-                <w:sz w:val="22"/>
-                <w:szCs w:val="22"/>
-                <w:lang w:val="es-ES" w:eastAsia="en-US" w:bidi="ar-SA"/>
+                <w:rFonts w:ascii="Times New Roman" w:hAnsi="Times New Roman"/>
               </w:rPr>
             </w:pPr>
             <w:r>
@@ -3172,30 +3180,1205 @@
               </w:r>
             </w:hyperlink>
           </w:p>
-          <w:p>
-            <w:pPr>
-              <w:pStyle w:val="Normal"/>
-              <w:widowControl/>
-              <w:suppressAutoHyphens w:val="true"/>
-              <w:bidi w:val="0"/>
-              <w:spacing w:lineRule="auto" w:line="240" w:before="0" w:after="0"/>
+        </w:tc>
+      </w:tr>
+    </w:tbl>
+    <w:p>
+      <w:pPr>
+        <w:pStyle w:val="Normal"/>
+        <w:spacing w:before="0" w:after="160"/>
+        <w:rPr>
+          <w:rFonts w:ascii="Times New Roman" w:hAnsi="Times New Roman"/>
+          <w:sz w:val="22"/>
+          <w:szCs w:val="22"/>
+        </w:rPr>
+      </w:pPr>
+      <w:r>
+        <w:rPr>
+          <w:rFonts w:ascii="Times New Roman" w:hAnsi="Times New Roman"/>
+          <w:sz w:val="22"/>
+          <w:szCs w:val="22"/>
+        </w:rPr>
+      </w:r>
+    </w:p>
+    <w:p>
+      <w:pPr>
+        <w:pStyle w:val="Normal"/>
+        <w:spacing w:before="0" w:after="160"/>
+        <w:rPr>
+          <w:rFonts w:ascii="Times New Roman" w:hAnsi="Times New Roman"/>
+          <w:sz w:val="22"/>
+          <w:szCs w:val="22"/>
+        </w:rPr>
+      </w:pPr>
+      <w:r>
+        <w:rPr>
+          <w:rFonts w:ascii="Times New Roman" w:hAnsi="Times New Roman"/>
+          <w:sz w:val="22"/>
+          <w:szCs w:val="22"/>
+        </w:rPr>
+      </w:r>
+    </w:p>
+    <w:tbl>
+      <w:tblPr>
+        <w:tblW w:w="5000" w:type="pct"/>
+        <w:jc w:val="start"/>
+        <w:tblInd w:w="-5" w:type="dxa"/>
+        <w:tblLayout w:type="fixed"/>
+        <w:tblCellMar>
+          <w:top w:w="58" w:type="dxa"/>
+          <w:start w:w="58" w:type="dxa"/>
+          <w:bottom w:w="58" w:type="dxa"/>
+          <w:end w:w="58" w:type="dxa"/>
+        </w:tblCellMar>
+      </w:tblPr>
+      <w:tblGrid>
+        <w:gridCol w:w="4252"/>
+        <w:gridCol w:w="4252"/>
+      </w:tblGrid>
+      <w:tr>
+        <w:trPr/>
+        <w:tc>
+          <w:tcPr>
+            <w:tcW w:w="8504" w:type="dxa"/>
+            <w:gridSpan w:val="2"/>
+            <w:tcBorders>
+              <w:top w:val="single" w:sz="4" w:space="0" w:color="000000"/>
+              <w:start w:val="single" w:sz="4" w:space="0" w:color="000000"/>
+              <w:bottom w:val="single" w:sz="4" w:space="0" w:color="000000"/>
+              <w:end w:val="single" w:sz="4" w:space="0" w:color="000000"/>
+            </w:tcBorders>
+            <w:shd w:fill="2A6099" w:val="clear"/>
+          </w:tcPr>
+          <w:p>
+            <w:pPr>
+              <w:pStyle w:val="Contenidodelatabla"/>
+              <w:spacing w:before="0" w:after="160"/>
+              <w:jc w:val="center"/>
+              <w:rPr>
+                <w:rFonts w:ascii="Times New Roman" w:hAnsi="Times New Roman"/>
+                <w:b/>
+                <w:bCs/>
+                <w:sz w:val="30"/>
+                <w:szCs w:val="30"/>
+              </w:rPr>
+            </w:pPr>
+            <w:r>
+              <w:rPr>
+                <w:rFonts w:ascii="Times New Roman" w:hAnsi="Times New Roman"/>
+                <w:b/>
+                <w:bCs/>
+                <w:sz w:val="30"/>
+                <w:szCs w:val="30"/>
+              </w:rPr>
+              <w:t>VENTAJAS</w:t>
+            </w:r>
+          </w:p>
+        </w:tc>
+      </w:tr>
+      <w:tr>
+        <w:trPr/>
+        <w:tc>
+          <w:tcPr>
+            <w:tcW w:w="4252" w:type="dxa"/>
+            <w:tcBorders>
+              <w:top w:val="single" w:sz="4" w:space="0" w:color="000000"/>
+              <w:start w:val="single" w:sz="4" w:space="0" w:color="000000"/>
+              <w:bottom w:val="single" w:sz="4" w:space="0" w:color="000000"/>
+              <w:end w:val="single" w:sz="4" w:space="0" w:color="000000"/>
+            </w:tcBorders>
+          </w:tcPr>
+          <w:p>
+            <w:pPr>
+              <w:pStyle w:val="Contenidodelatabla"/>
+              <w:spacing w:lineRule="auto" w:line="274" w:before="0" w:after="0"/>
+              <w:ind w:hanging="0" w:start="0" w:end="0"/>
+              <w:jc w:val="center"/>
+              <w:rPr/>
+            </w:pPr>
+            <w:r>
+              <w:rPr>
+                <w:rStyle w:val="Strong"/>
+                <w:rFonts w:ascii="Times New Roman" w:hAnsi="Times New Roman"/>
+                <w:b/>
+                <w:bCs/>
+                <w:sz w:val="26"/>
+                <w:szCs w:val="26"/>
+              </w:rPr>
+              <w:t>Paradigma</w:t>
+            </w:r>
+            <w:r>
+              <w:rPr>
+                <w:rFonts w:ascii="Times New Roman" w:hAnsi="Times New Roman"/>
+                <w:b/>
+                <w:bCs/>
+                <w:sz w:val="26"/>
+                <w:szCs w:val="26"/>
+              </w:rPr>
+              <w:t xml:space="preserve"> </w:t>
+            </w:r>
+          </w:p>
+        </w:tc>
+        <w:tc>
+          <w:tcPr>
+            <w:tcW w:w="4252" w:type="dxa"/>
+            <w:tcBorders>
+              <w:top w:val="single" w:sz="4" w:space="0" w:color="000000"/>
+              <w:start w:val="single" w:sz="4" w:space="0" w:color="000000"/>
+              <w:bottom w:val="single" w:sz="4" w:space="0" w:color="000000"/>
+              <w:end w:val="single" w:sz="4" w:space="0" w:color="000000"/>
+            </w:tcBorders>
+          </w:tcPr>
+          <w:p>
+            <w:pPr>
+              <w:pStyle w:val="Contenidodelatabla"/>
+              <w:spacing w:before="0" w:after="160"/>
+              <w:jc w:val="center"/>
+              <w:rPr>
+                <w:rFonts w:ascii="Times New Roman" w:hAnsi="Times New Roman"/>
+                <w:b/>
+                <w:bCs/>
+                <w:sz w:val="26"/>
+                <w:szCs w:val="26"/>
+              </w:rPr>
+            </w:pPr>
+            <w:r>
+              <w:rPr>
+                <w:rFonts w:ascii="Times New Roman" w:hAnsi="Times New Roman"/>
+                <w:b/>
+                <w:bCs/>
+                <w:sz w:val="26"/>
+                <w:szCs w:val="26"/>
+              </w:rPr>
+              <w:t xml:space="preserve">Principales Ventajas </w:t>
+            </w:r>
+          </w:p>
+        </w:tc>
+      </w:tr>
+      <w:tr>
+        <w:trPr/>
+        <w:tc>
+          <w:tcPr>
+            <w:tcW w:w="4252" w:type="dxa"/>
+            <w:tcBorders>
+              <w:top w:val="single" w:sz="4" w:space="0" w:color="000000"/>
+              <w:start w:val="single" w:sz="4" w:space="0" w:color="000000"/>
+              <w:bottom w:val="single" w:sz="4" w:space="0" w:color="000000"/>
+              <w:end w:val="single" w:sz="4" w:space="0" w:color="000000"/>
+            </w:tcBorders>
+          </w:tcPr>
+          <w:p>
+            <w:pPr>
+              <w:pStyle w:val="Contenidodelatabla"/>
+              <w:spacing w:before="0" w:after="160"/>
               <w:jc w:val="start"/>
               <w:rPr>
-                <w:rFonts w:ascii="Times New Roman" w:hAnsi="Times New Roman" w:eastAsia="Aptos" w:cs=""/>
-                <w:kern w:val="2"/>
-                <w:sz w:val="22"/>
-                <w:szCs w:val="22"/>
-                <w:lang w:val="es-ES" w:eastAsia="en-US" w:bidi="ar-SA"/>
-              </w:rPr>
-            </w:pPr>
-            <w:r>
-              <w:rPr>
-                <w:rFonts w:eastAsia="Aptos" w:cs="" w:ascii="Times New Roman" w:hAnsi="Times New Roman"/>
-                <w:kern w:val="2"/>
-                <w:sz w:val="22"/>
-                <w:szCs w:val="22"/>
-                <w:lang w:val="es-ES" w:eastAsia="en-US" w:bidi="ar-SA"/>
-              </w:rPr>
+                <w:rFonts w:ascii="Times New Roman" w:hAnsi="Times New Roman"/>
+              </w:rPr>
+            </w:pPr>
+            <w:r>
+              <w:rPr>
+                <w:rFonts w:ascii="Times New Roman" w:hAnsi="Times New Roman"/>
+              </w:rPr>
+              <w:t>Concurrente</w:t>
+            </w:r>
+          </w:p>
+        </w:tc>
+        <w:tc>
+          <w:tcPr>
+            <w:tcW w:w="4252" w:type="dxa"/>
+            <w:tcBorders>
+              <w:top w:val="single" w:sz="4" w:space="0" w:color="000000"/>
+              <w:start w:val="single" w:sz="4" w:space="0" w:color="000000"/>
+              <w:bottom w:val="single" w:sz="4" w:space="0" w:color="000000"/>
+              <w:end w:val="single" w:sz="4" w:space="0" w:color="000000"/>
+            </w:tcBorders>
+          </w:tcPr>
+          <w:p>
+            <w:pPr>
+              <w:pStyle w:val="BodyText"/>
+              <w:rPr>
+                <w:rFonts w:ascii="Times New Roman" w:hAnsi="Times New Roman"/>
+              </w:rPr>
+            </w:pPr>
+            <w:r>
+              <w:rPr>
+                <w:rFonts w:ascii="Times New Roman" w:hAnsi="Times New Roman"/>
+              </w:rPr>
+              <w:t xml:space="preserve">• </w:t>
+            </w:r>
+            <w:r>
+              <w:rPr>
+                <w:rFonts w:ascii="Times New Roman" w:hAnsi="Times New Roman"/>
+                <w:b/>
+              </w:rPr>
+              <w:t>Mayor responsividad:</w:t>
+            </w:r>
+            <w:r>
+              <w:rPr>
+                <w:rFonts w:ascii="Times New Roman" w:hAnsi="Times New Roman"/>
+              </w:rPr>
+              <w:t xml:space="preserve"> La interfaz no se congela ante tareas I/O bloqueantes.</w:t>
+            </w:r>
+          </w:p>
+          <w:p>
+            <w:pPr>
+              <w:pStyle w:val="BodyText"/>
+              <w:widowControl w:val="false"/>
+              <w:spacing w:lineRule="auto" w:line="259" w:before="0" w:after="160"/>
+              <w:rPr>
+                <w:rFonts w:ascii="Times New Roman" w:hAnsi="Times New Roman"/>
+              </w:rPr>
+            </w:pPr>
+            <w:r>
+              <w:rPr>
+                <w:rFonts w:ascii="Times New Roman" w:hAnsi="Times New Roman"/>
+              </w:rPr>
+              <w:t xml:space="preserve">• </w:t>
+            </w:r>
+            <w:r>
+              <w:rPr>
+                <w:rFonts w:ascii="Times New Roman" w:hAnsi="Times New Roman"/>
+                <w:b/>
+              </w:rPr>
+              <w:t>Aprovechamiento de tiempos muertos:</w:t>
+            </w:r>
+            <w:r>
+              <w:rPr>
+                <w:rFonts w:ascii="Times New Roman" w:hAnsi="Times New Roman"/>
+              </w:rPr>
+              <w:t xml:space="preserve"> Alterna tareas mientras espera respuestas externas (disco, red).</w:t>
+            </w:r>
+          </w:p>
+          <w:p>
+            <w:pPr>
+              <w:pStyle w:val="BodyText"/>
+              <w:widowControl w:val="false"/>
+              <w:spacing w:lineRule="auto" w:line="259" w:before="0" w:after="160"/>
+              <w:rPr>
+                <w:rFonts w:ascii="Times New Roman" w:hAnsi="Times New Roman"/>
+              </w:rPr>
+            </w:pPr>
+            <w:r>
+              <w:rPr>
+                <w:rFonts w:ascii="Times New Roman" w:hAnsi="Times New Roman"/>
+              </w:rPr>
+              <w:t xml:space="preserve">• </w:t>
+            </w:r>
+            <w:r>
+              <w:rPr>
+                <w:rFonts w:ascii="Times New Roman" w:hAnsi="Times New Roman"/>
+                <w:b/>
+              </w:rPr>
+              <w:t>Estructura modular:</w:t>
+            </w:r>
+            <w:r>
+              <w:rPr>
+                <w:rFonts w:ascii="Times New Roman" w:hAnsi="Times New Roman"/>
+              </w:rPr>
+              <w:t xml:space="preserve"> Facilita desacoplar componentes independientes (ej. productor-consumidor).</w:t>
+            </w:r>
+          </w:p>
+        </w:tc>
+      </w:tr>
+      <w:tr>
+        <w:trPr/>
+        <w:tc>
+          <w:tcPr>
+            <w:tcW w:w="4252" w:type="dxa"/>
+            <w:tcBorders>
+              <w:top w:val="single" w:sz="4" w:space="0" w:color="000000"/>
+              <w:start w:val="single" w:sz="4" w:space="0" w:color="000000"/>
+              <w:bottom w:val="single" w:sz="4" w:space="0" w:color="000000"/>
+              <w:end w:val="single" w:sz="4" w:space="0" w:color="000000"/>
+            </w:tcBorders>
+          </w:tcPr>
+          <w:p>
+            <w:pPr>
+              <w:pStyle w:val="Contenidodelatabla"/>
+              <w:spacing w:before="0" w:after="160"/>
+              <w:rPr>
+                <w:rFonts w:ascii="Times New Roman" w:hAnsi="Times New Roman"/>
+              </w:rPr>
+            </w:pPr>
+            <w:r>
+              <w:rPr>
+                <w:rFonts w:ascii="Times New Roman" w:hAnsi="Times New Roman"/>
+              </w:rPr>
+              <w:t>Paralela</w:t>
+            </w:r>
+          </w:p>
+        </w:tc>
+        <w:tc>
+          <w:tcPr>
+            <w:tcW w:w="4252" w:type="dxa"/>
+            <w:tcBorders>
+              <w:top w:val="single" w:sz="4" w:space="0" w:color="000000"/>
+              <w:start w:val="single" w:sz="4" w:space="0" w:color="000000"/>
+              <w:bottom w:val="single" w:sz="4" w:space="0" w:color="000000"/>
+              <w:end w:val="single" w:sz="4" w:space="0" w:color="000000"/>
+            </w:tcBorders>
+          </w:tcPr>
+          <w:p>
+            <w:pPr>
+              <w:pStyle w:val="BodyText"/>
+              <w:rPr>
+                <w:rFonts w:ascii="Times New Roman" w:hAnsi="Times New Roman"/>
+              </w:rPr>
+            </w:pPr>
+            <w:r>
+              <w:rPr>
+                <w:rFonts w:ascii="Times New Roman" w:hAnsi="Times New Roman"/>
+              </w:rPr>
+              <w:t xml:space="preserve">• </w:t>
+            </w:r>
+            <w:r>
+              <w:rPr>
+                <w:rFonts w:ascii="Times New Roman" w:hAnsi="Times New Roman"/>
+                <w:b/>
+              </w:rPr>
+              <w:t>Rendimiento y velocidad máxima:</w:t>
+            </w:r>
+            <w:r>
+              <w:rPr>
+                <w:rFonts w:ascii="Times New Roman" w:hAnsi="Times New Roman"/>
+              </w:rPr>
+              <w:t xml:space="preserve"> Reduce drásticamente el tiempo de ejecución dividiendo carga computacional.</w:t>
+            </w:r>
+          </w:p>
+          <w:p>
+            <w:pPr>
+              <w:pStyle w:val="BodyText"/>
+              <w:widowControl w:val="false"/>
+              <w:spacing w:lineRule="auto" w:line="259" w:before="0" w:after="160"/>
+              <w:rPr>
+                <w:rFonts w:ascii="Times New Roman" w:hAnsi="Times New Roman"/>
+              </w:rPr>
+            </w:pPr>
+            <w:r>
+              <w:rPr>
+                <w:rFonts w:ascii="Times New Roman" w:hAnsi="Times New Roman"/>
+              </w:rPr>
+              <w:t xml:space="preserve">• </w:t>
+            </w:r>
+            <w:r>
+              <w:rPr>
+                <w:rFonts w:ascii="Times New Roman" w:hAnsi="Times New Roman"/>
+                <w:b/>
+              </w:rPr>
+              <w:t>Aprovechamiento del hardware multinúcleo/GPU:</w:t>
+            </w:r>
+            <w:r>
+              <w:rPr>
+                <w:rFonts w:ascii="Times New Roman" w:hAnsi="Times New Roman"/>
+              </w:rPr>
+              <w:t xml:space="preserve"> Ejecución verdaderamente simultánea en varias CPUs/cores.</w:t>
+            </w:r>
+          </w:p>
+          <w:p>
+            <w:pPr>
+              <w:pStyle w:val="BodyText"/>
+              <w:widowControl w:val="false"/>
+              <w:spacing w:lineRule="auto" w:line="259" w:before="0" w:after="160"/>
+              <w:rPr>
+                <w:rFonts w:ascii="Times New Roman" w:hAnsi="Times New Roman"/>
+              </w:rPr>
+            </w:pPr>
+            <w:r>
+              <w:rPr>
+                <w:rFonts w:ascii="Times New Roman" w:hAnsi="Times New Roman"/>
+              </w:rPr>
+              <w:t xml:space="preserve">• </w:t>
+            </w:r>
+            <w:r>
+              <w:rPr>
+                <w:rFonts w:ascii="Times New Roman" w:hAnsi="Times New Roman"/>
+                <w:b/>
+              </w:rPr>
+              <w:t>Alta eficiencia en tareas pesadas de cómputo:</w:t>
+            </w:r>
+            <w:r>
+              <w:rPr>
+                <w:rFonts w:ascii="Times New Roman" w:hAnsi="Times New Roman"/>
+              </w:rPr>
+              <w:t xml:space="preserve"> Escalabilidad en problemas masivos de cálculo.</w:t>
+            </w:r>
+          </w:p>
+        </w:tc>
+      </w:tr>
+      <w:tr>
+        <w:trPr/>
+        <w:tc>
+          <w:tcPr>
+            <w:tcW w:w="4252" w:type="dxa"/>
+            <w:tcBorders>
+              <w:top w:val="single" w:sz="4" w:space="0" w:color="000000"/>
+              <w:start w:val="single" w:sz="4" w:space="0" w:color="000000"/>
+              <w:bottom w:val="single" w:sz="4" w:space="0" w:color="000000"/>
+              <w:end w:val="single" w:sz="4" w:space="0" w:color="000000"/>
+            </w:tcBorders>
+          </w:tcPr>
+          <w:p>
+            <w:pPr>
+              <w:pStyle w:val="Contenidodelatabla"/>
+              <w:spacing w:before="0" w:after="160"/>
+              <w:rPr>
+                <w:rFonts w:ascii="Times New Roman" w:hAnsi="Times New Roman"/>
+              </w:rPr>
+            </w:pPr>
+            <w:r>
+              <w:rPr>
+                <w:rFonts w:ascii="Times New Roman" w:hAnsi="Times New Roman"/>
+              </w:rPr>
+              <w:t>Distribuida</w:t>
+            </w:r>
+          </w:p>
+        </w:tc>
+        <w:tc>
+          <w:tcPr>
+            <w:tcW w:w="4252" w:type="dxa"/>
+            <w:tcBorders>
+              <w:top w:val="single" w:sz="4" w:space="0" w:color="000000"/>
+              <w:start w:val="single" w:sz="4" w:space="0" w:color="000000"/>
+              <w:bottom w:val="single" w:sz="4" w:space="0" w:color="000000"/>
+              <w:end w:val="single" w:sz="4" w:space="0" w:color="000000"/>
+            </w:tcBorders>
+          </w:tcPr>
+          <w:p>
+            <w:pPr>
+              <w:pStyle w:val="BodyText"/>
+              <w:rPr>
+                <w:rFonts w:ascii="Times New Roman" w:hAnsi="Times New Roman"/>
+              </w:rPr>
+            </w:pPr>
+            <w:r>
+              <w:rPr>
+                <w:rFonts w:ascii="Times New Roman" w:hAnsi="Times New Roman"/>
+              </w:rPr>
+              <w:t xml:space="preserve">• </w:t>
+            </w:r>
+            <w:r>
+              <w:rPr>
+                <w:rFonts w:ascii="Times New Roman" w:hAnsi="Times New Roman"/>
+                <w:b/>
+              </w:rPr>
+              <w:t>Alta disponibilidad y tolerancia a fallos:</w:t>
+            </w:r>
+            <w:r>
+              <w:rPr>
+                <w:rFonts w:ascii="Times New Roman" w:hAnsi="Times New Roman"/>
+              </w:rPr>
+              <w:t xml:space="preserve"> Si un nodo cae, otros asumen la carga sin tumbar el sistema.</w:t>
+            </w:r>
+          </w:p>
+          <w:p>
+            <w:pPr>
+              <w:pStyle w:val="BodyText"/>
+              <w:widowControl w:val="false"/>
+              <w:spacing w:lineRule="auto" w:line="259" w:before="0" w:after="160"/>
+              <w:rPr>
+                <w:rFonts w:ascii="Times New Roman" w:hAnsi="Times New Roman"/>
+              </w:rPr>
+            </w:pPr>
+            <w:r>
+              <w:rPr>
+                <w:rFonts w:ascii="Times New Roman" w:hAnsi="Times New Roman"/>
+              </w:rPr>
+              <w:t xml:space="preserve">• </w:t>
+            </w:r>
+            <w:r>
+              <w:rPr>
+                <w:rFonts w:ascii="Times New Roman" w:hAnsi="Times New Roman"/>
+                <w:b/>
+              </w:rPr>
+              <w:t>Escalabilidad horizontal (scale-out):</w:t>
+            </w:r>
+            <w:r>
+              <w:rPr>
+                <w:rFonts w:ascii="Times New Roman" w:hAnsi="Times New Roman"/>
+              </w:rPr>
+              <w:t xml:space="preserve"> Permite crecer añadiendo máquinas económicas en clúster.</w:t>
+            </w:r>
+          </w:p>
+          <w:p>
+            <w:pPr>
+              <w:pStyle w:val="BodyText"/>
+              <w:widowControl w:val="false"/>
+              <w:spacing w:lineRule="auto" w:line="259" w:before="0" w:after="160"/>
+              <w:rPr>
+                <w:rFonts w:ascii="Times New Roman" w:hAnsi="Times New Roman"/>
+              </w:rPr>
+            </w:pPr>
+            <w:r>
+              <w:rPr>
+                <w:rFonts w:ascii="Times New Roman" w:hAnsi="Times New Roman"/>
+              </w:rPr>
+              <w:t xml:space="preserve">• </w:t>
+            </w:r>
+            <w:r>
+              <w:rPr>
+                <w:rFonts w:ascii="Times New Roman" w:hAnsi="Times New Roman"/>
+                <w:b/>
+              </w:rPr>
+              <w:t>Compartición de recursos y acceso geográfico:</w:t>
+            </w:r>
+            <w:r>
+              <w:rPr>
+                <w:rFonts w:ascii="Times New Roman" w:hAnsi="Times New Roman"/>
+              </w:rPr>
+              <w:t xml:space="preserve"> Permite procesar datos cerca de donde se generan o consumen.</w:t>
+            </w:r>
+          </w:p>
+          <w:p>
+            <w:pPr>
+              <w:pStyle w:val="Contenidodelatabla"/>
+              <w:spacing w:before="0" w:after="160"/>
+              <w:rPr>
+                <w:rFonts w:ascii="Times New Roman" w:hAnsi="Times New Roman"/>
+              </w:rPr>
+            </w:pPr>
+            <w:r>
+              <w:rPr>
+                <w:rFonts w:ascii="Times New Roman" w:hAnsi="Times New Roman"/>
+              </w:rPr>
+            </w:r>
+          </w:p>
+        </w:tc>
+      </w:tr>
+    </w:tbl>
+    <w:p>
+      <w:pPr>
+        <w:pStyle w:val="Normal"/>
+        <w:spacing w:before="0" w:after="160"/>
+        <w:rPr>
+          <w:rFonts w:ascii="Times New Roman" w:hAnsi="Times New Roman"/>
+          <w:sz w:val="22"/>
+          <w:szCs w:val="22"/>
+        </w:rPr>
+      </w:pPr>
+      <w:r>
+        <w:rPr>
+          <w:rFonts w:ascii="Times New Roman" w:hAnsi="Times New Roman"/>
+          <w:sz w:val="22"/>
+          <w:szCs w:val="22"/>
+        </w:rPr>
+      </w:r>
+    </w:p>
+    <w:p>
+      <w:pPr>
+        <w:pStyle w:val="Normal"/>
+        <w:spacing w:before="0" w:after="160"/>
+        <w:rPr>
+          <w:rFonts w:ascii="Times New Roman" w:hAnsi="Times New Roman"/>
+          <w:sz w:val="22"/>
+          <w:szCs w:val="22"/>
+        </w:rPr>
+      </w:pPr>
+      <w:r>
+        <w:rPr>
+          <w:rFonts w:ascii="Times New Roman" w:hAnsi="Times New Roman"/>
+          <w:sz w:val="22"/>
+          <w:szCs w:val="22"/>
+        </w:rPr>
+      </w:r>
+    </w:p>
+    <w:p>
+      <w:pPr>
+        <w:pStyle w:val="Normal"/>
+        <w:spacing w:before="0" w:after="160"/>
+        <w:rPr>
+          <w:rFonts w:ascii="Times New Roman" w:hAnsi="Times New Roman"/>
+          <w:sz w:val="22"/>
+          <w:szCs w:val="22"/>
+        </w:rPr>
+      </w:pPr>
+      <w:r>
+        <w:rPr>
+          <w:rFonts w:ascii="Times New Roman" w:hAnsi="Times New Roman"/>
+          <w:sz w:val="22"/>
+          <w:szCs w:val="22"/>
+        </w:rPr>
+      </w:r>
+    </w:p>
+    <w:tbl>
+      <w:tblPr>
+        <w:tblW w:w="5000" w:type="pct"/>
+        <w:jc w:val="start"/>
+        <w:tblInd w:w="-5" w:type="dxa"/>
+        <w:tblLayout w:type="fixed"/>
+        <w:tblCellMar>
+          <w:top w:w="58" w:type="dxa"/>
+          <w:start w:w="58" w:type="dxa"/>
+          <w:bottom w:w="58" w:type="dxa"/>
+          <w:end w:w="58" w:type="dxa"/>
+        </w:tblCellMar>
+      </w:tblPr>
+      <w:tblGrid>
+        <w:gridCol w:w="4252"/>
+        <w:gridCol w:w="4252"/>
+      </w:tblGrid>
+      <w:tr>
+        <w:trPr/>
+        <w:tc>
+          <w:tcPr>
+            <w:tcW w:w="8504" w:type="dxa"/>
+            <w:gridSpan w:val="2"/>
+            <w:tcBorders>
+              <w:top w:val="single" w:sz="4" w:space="0" w:color="000000"/>
+              <w:start w:val="single" w:sz="4" w:space="0" w:color="000000"/>
+              <w:bottom w:val="single" w:sz="4" w:space="0" w:color="000000"/>
+              <w:end w:val="single" w:sz="4" w:space="0" w:color="000000"/>
+            </w:tcBorders>
+            <w:shd w:fill="2A6099" w:val="clear"/>
+          </w:tcPr>
+          <w:p>
+            <w:pPr>
+              <w:pStyle w:val="Contenidodelatabla"/>
+              <w:spacing w:before="0" w:after="160"/>
+              <w:jc w:val="center"/>
+              <w:rPr>
+                <w:rFonts w:ascii="Times New Roman" w:hAnsi="Times New Roman"/>
+                <w:b/>
+                <w:bCs/>
+                <w:sz w:val="30"/>
+                <w:szCs w:val="30"/>
+              </w:rPr>
+            </w:pPr>
+            <w:r>
+              <w:rPr>
+                <w:rFonts w:ascii="Times New Roman" w:hAnsi="Times New Roman"/>
+                <w:b/>
+                <w:bCs/>
+                <w:sz w:val="30"/>
+                <w:szCs w:val="30"/>
+              </w:rPr>
+              <w:t>INCONVENIENTES</w:t>
+            </w:r>
+          </w:p>
+        </w:tc>
+      </w:tr>
+      <w:tr>
+        <w:trPr/>
+        <w:tc>
+          <w:tcPr>
+            <w:tcW w:w="4252" w:type="dxa"/>
+            <w:tcBorders>
+              <w:top w:val="single" w:sz="4" w:space="0" w:color="000000"/>
+              <w:start w:val="single" w:sz="4" w:space="0" w:color="000000"/>
+              <w:bottom w:val="single" w:sz="4" w:space="0" w:color="000000"/>
+              <w:end w:val="single" w:sz="4" w:space="0" w:color="000000"/>
+            </w:tcBorders>
+          </w:tcPr>
+          <w:p>
+            <w:pPr>
+              <w:pStyle w:val="Contenidodelatabla"/>
+              <w:spacing w:lineRule="auto" w:line="274" w:before="0" w:after="0"/>
+              <w:ind w:hanging="0" w:start="0" w:end="0"/>
+              <w:jc w:val="center"/>
+              <w:rPr/>
+            </w:pPr>
+            <w:r>
+              <w:rPr>
+                <w:rStyle w:val="Strong"/>
+                <w:rFonts w:ascii="Times New Roman" w:hAnsi="Times New Roman"/>
+                <w:b/>
+                <w:bCs/>
+                <w:sz w:val="26"/>
+                <w:szCs w:val="26"/>
+              </w:rPr>
+              <w:t>Paradigma</w:t>
+            </w:r>
+            <w:r>
+              <w:rPr>
+                <w:rFonts w:ascii="Times New Roman" w:hAnsi="Times New Roman"/>
+                <w:b/>
+                <w:bCs/>
+                <w:sz w:val="26"/>
+                <w:szCs w:val="26"/>
+              </w:rPr>
+              <w:t xml:space="preserve"> </w:t>
+            </w:r>
+          </w:p>
+        </w:tc>
+        <w:tc>
+          <w:tcPr>
+            <w:tcW w:w="4252" w:type="dxa"/>
+            <w:tcBorders>
+              <w:top w:val="single" w:sz="4" w:space="0" w:color="000000"/>
+              <w:start w:val="single" w:sz="4" w:space="0" w:color="000000"/>
+              <w:bottom w:val="single" w:sz="4" w:space="0" w:color="000000"/>
+              <w:end w:val="single" w:sz="4" w:space="0" w:color="000000"/>
+            </w:tcBorders>
+          </w:tcPr>
+          <w:p>
+            <w:pPr>
+              <w:pStyle w:val="Contenidodelatabla"/>
+              <w:spacing w:before="0" w:after="160"/>
+              <w:jc w:val="center"/>
+              <w:rPr>
+                <w:rFonts w:ascii="Times New Roman" w:hAnsi="Times New Roman"/>
+                <w:b/>
+                <w:bCs/>
+                <w:sz w:val="26"/>
+                <w:szCs w:val="26"/>
+              </w:rPr>
+            </w:pPr>
+            <w:r>
+              <w:rPr>
+                <w:rFonts w:ascii="Times New Roman" w:hAnsi="Times New Roman"/>
+                <w:b/>
+                <w:bCs/>
+                <w:sz w:val="26"/>
+                <w:szCs w:val="26"/>
+              </w:rPr>
+              <w:t xml:space="preserve">Principales </w:t>
+            </w:r>
+            <w:r>
+              <w:rPr>
+                <w:rFonts w:ascii="Times New Roman" w:hAnsi="Times New Roman"/>
+                <w:b/>
+                <w:bCs/>
+                <w:sz w:val="26"/>
+                <w:szCs w:val="26"/>
+              </w:rPr>
+              <w:t>Inconvenientes</w:t>
+            </w:r>
+            <w:r>
+              <w:rPr>
+                <w:rFonts w:ascii="Times New Roman" w:hAnsi="Times New Roman"/>
+                <w:b/>
+                <w:bCs/>
+                <w:sz w:val="26"/>
+                <w:szCs w:val="26"/>
+              </w:rPr>
+              <w:t xml:space="preserve"> </w:t>
+            </w:r>
+          </w:p>
+        </w:tc>
+      </w:tr>
+      <w:tr>
+        <w:trPr/>
+        <w:tc>
+          <w:tcPr>
+            <w:tcW w:w="4252" w:type="dxa"/>
+            <w:tcBorders>
+              <w:top w:val="single" w:sz="4" w:space="0" w:color="000000"/>
+              <w:start w:val="single" w:sz="4" w:space="0" w:color="000000"/>
+              <w:bottom w:val="single" w:sz="4" w:space="0" w:color="000000"/>
+              <w:end w:val="single" w:sz="4" w:space="0" w:color="000000"/>
+            </w:tcBorders>
+          </w:tcPr>
+          <w:p>
+            <w:pPr>
+              <w:pStyle w:val="Contenidodelatabla"/>
+              <w:spacing w:before="0" w:after="160"/>
+              <w:rPr>
+                <w:rFonts w:ascii="Times New Roman" w:hAnsi="Times New Roman"/>
+              </w:rPr>
+            </w:pPr>
+            <w:r>
+              <w:rPr>
+                <w:rFonts w:ascii="Times New Roman" w:hAnsi="Times New Roman"/>
+              </w:rPr>
+              <w:t>Concurrente</w:t>
+            </w:r>
+          </w:p>
+        </w:tc>
+        <w:tc>
+          <w:tcPr>
+            <w:tcW w:w="4252" w:type="dxa"/>
+            <w:tcBorders>
+              <w:top w:val="single" w:sz="4" w:space="0" w:color="000000"/>
+              <w:start w:val="single" w:sz="4" w:space="0" w:color="000000"/>
+              <w:bottom w:val="single" w:sz="4" w:space="0" w:color="000000"/>
+              <w:end w:val="single" w:sz="4" w:space="0" w:color="000000"/>
+            </w:tcBorders>
+          </w:tcPr>
+          <w:p>
+            <w:pPr>
+              <w:pStyle w:val="BodyText"/>
+              <w:rPr>
+                <w:rFonts w:ascii="Times New Roman" w:hAnsi="Times New Roman"/>
+              </w:rPr>
+            </w:pPr>
+            <w:r>
+              <w:rPr>
+                <w:rFonts w:ascii="Times New Roman" w:hAnsi="Times New Roman"/>
+              </w:rPr>
+              <w:t xml:space="preserve">• </w:t>
+            </w:r>
+            <w:r>
+              <w:rPr>
+                <w:rFonts w:ascii="Times New Roman" w:hAnsi="Times New Roman"/>
+                <w:b/>
+              </w:rPr>
+              <w:t>No determinismo y depuración difícil:</w:t>
+            </w:r>
+            <w:r>
+              <w:rPr>
+                <w:rFonts w:ascii="Times New Roman" w:hAnsi="Times New Roman"/>
+              </w:rPr>
+              <w:t xml:space="preserve"> Los fallos dependen del </w:t>
+            </w:r>
+            <w:r>
+              <w:rPr>
+                <w:rFonts w:ascii="Times New Roman" w:hAnsi="Times New Roman"/>
+                <w:i/>
+              </w:rPr>
+              <w:t>timing</w:t>
+            </w:r>
+            <w:r>
+              <w:rPr>
+                <w:rFonts w:ascii="Times New Roman" w:hAnsi="Times New Roman"/>
+              </w:rPr>
+              <w:t xml:space="preserve"> y rara vez son reproducibles.</w:t>
+            </w:r>
+          </w:p>
+          <w:p>
+            <w:pPr>
+              <w:pStyle w:val="BodyText"/>
+              <w:widowControl w:val="false"/>
+              <w:spacing w:lineRule="auto" w:line="259" w:before="0" w:after="160"/>
+              <w:rPr>
+                <w:rFonts w:ascii="Times New Roman" w:hAnsi="Times New Roman"/>
+              </w:rPr>
+            </w:pPr>
+            <w:r>
+              <w:rPr>
+                <w:rFonts w:ascii="Times New Roman" w:hAnsi="Times New Roman"/>
+              </w:rPr>
+              <w:t xml:space="preserve">• </w:t>
+            </w:r>
+            <w:r>
+              <w:rPr>
+                <w:rFonts w:ascii="Times New Roman" w:hAnsi="Times New Roman"/>
+                <w:b/>
+              </w:rPr>
+              <w:t>Problemas de sincronización:</w:t>
+            </w:r>
+            <w:r>
+              <w:rPr>
+                <w:rFonts w:ascii="Times New Roman" w:hAnsi="Times New Roman"/>
+              </w:rPr>
+              <w:t xml:space="preserve"> Riesgo constante de </w:t>
+            </w:r>
+            <w:r>
+              <w:rPr>
+                <w:rFonts w:ascii="Times New Roman" w:hAnsi="Times New Roman"/>
+                <w:i/>
+              </w:rPr>
+              <w:t>deadlocks</w:t>
+            </w:r>
+            <w:r>
+              <w:rPr>
+                <w:rFonts w:ascii="Times New Roman" w:hAnsi="Times New Roman"/>
+              </w:rPr>
+              <w:t xml:space="preserve"> (interbloqueos), </w:t>
+            </w:r>
+            <w:r>
+              <w:rPr>
+                <w:rFonts w:ascii="Times New Roman" w:hAnsi="Times New Roman"/>
+                <w:i/>
+              </w:rPr>
+              <w:t>race conditions</w:t>
+            </w:r>
+            <w:r>
+              <w:rPr>
+                <w:rFonts w:ascii="Times New Roman" w:hAnsi="Times New Roman"/>
+              </w:rPr>
+              <w:t xml:space="preserve"> e inanición.</w:t>
+            </w:r>
+          </w:p>
+          <w:p>
+            <w:pPr>
+              <w:pStyle w:val="BodyText"/>
+              <w:widowControl w:val="false"/>
+              <w:spacing w:lineRule="auto" w:line="259" w:before="0" w:after="160"/>
+              <w:rPr>
+                <w:rFonts w:ascii="Times New Roman" w:hAnsi="Times New Roman"/>
+              </w:rPr>
+            </w:pPr>
+            <w:r>
+              <w:rPr>
+                <w:rFonts w:ascii="Times New Roman" w:hAnsi="Times New Roman"/>
+              </w:rPr>
+              <w:t xml:space="preserve">• </w:t>
+            </w:r>
+            <w:r>
+              <w:rPr>
+                <w:rFonts w:ascii="Times New Roman" w:hAnsi="Times New Roman"/>
+                <w:b/>
+              </w:rPr>
+              <w:t>Sobrecarga de contexto:</w:t>
+            </w:r>
+            <w:r>
+              <w:rPr>
+                <w:rFonts w:ascii="Times New Roman" w:hAnsi="Times New Roman"/>
+              </w:rPr>
+              <w:t xml:space="preserve"> El cambio de contexto frecuente (</w:t>
+            </w:r>
+            <w:r>
+              <w:rPr>
+                <w:rFonts w:ascii="Times New Roman" w:hAnsi="Times New Roman"/>
+                <w:i/>
+              </w:rPr>
+              <w:t>context switching</w:t>
+            </w:r>
+            <w:r>
+              <w:rPr>
+                <w:rFonts w:ascii="Times New Roman" w:hAnsi="Times New Roman"/>
+              </w:rPr>
+              <w:t>) puede penalizar la CPU.</w:t>
+            </w:r>
+          </w:p>
+        </w:tc>
+      </w:tr>
+      <w:tr>
+        <w:trPr/>
+        <w:tc>
+          <w:tcPr>
+            <w:tcW w:w="4252" w:type="dxa"/>
+            <w:tcBorders>
+              <w:top w:val="single" w:sz="4" w:space="0" w:color="000000"/>
+              <w:start w:val="single" w:sz="4" w:space="0" w:color="000000"/>
+              <w:bottom w:val="single" w:sz="4" w:space="0" w:color="000000"/>
+              <w:end w:val="single" w:sz="4" w:space="0" w:color="000000"/>
+            </w:tcBorders>
+          </w:tcPr>
+          <w:p>
+            <w:pPr>
+              <w:pStyle w:val="Contenidodelatabla"/>
+              <w:spacing w:before="0" w:after="160"/>
+              <w:rPr>
+                <w:rFonts w:ascii="Times New Roman" w:hAnsi="Times New Roman"/>
+              </w:rPr>
+            </w:pPr>
+            <w:r>
+              <w:rPr>
+                <w:rFonts w:ascii="Times New Roman" w:hAnsi="Times New Roman"/>
+              </w:rPr>
+              <w:t>Paralela</w:t>
+            </w:r>
+          </w:p>
+        </w:tc>
+        <w:tc>
+          <w:tcPr>
+            <w:tcW w:w="4252" w:type="dxa"/>
+            <w:tcBorders>
+              <w:top w:val="single" w:sz="4" w:space="0" w:color="000000"/>
+              <w:start w:val="single" w:sz="4" w:space="0" w:color="000000"/>
+              <w:bottom w:val="single" w:sz="4" w:space="0" w:color="000000"/>
+              <w:end w:val="single" w:sz="4" w:space="0" w:color="000000"/>
+            </w:tcBorders>
+          </w:tcPr>
+          <w:p>
+            <w:pPr>
+              <w:pStyle w:val="BodyText"/>
+              <w:rPr>
+                <w:rFonts w:ascii="Times New Roman" w:hAnsi="Times New Roman"/>
+              </w:rPr>
+            </w:pPr>
+            <w:r>
+              <w:rPr>
+                <w:rFonts w:ascii="Times New Roman" w:hAnsi="Times New Roman"/>
+              </w:rPr>
+              <w:t xml:space="preserve">• </w:t>
+            </w:r>
+            <w:r>
+              <w:rPr>
+                <w:rFonts w:ascii="Times New Roman" w:hAnsi="Times New Roman"/>
+                <w:b/>
+              </w:rPr>
+              <w:t>Dependencia directa del hardware:</w:t>
+            </w:r>
+            <w:r>
+              <w:rPr>
+                <w:rFonts w:ascii="Times New Roman" w:hAnsi="Times New Roman"/>
+              </w:rPr>
+              <w:t xml:space="preserve"> Requiere arquitecturas específicas (multinúcleo, GPUs dedicadas).</w:t>
+            </w:r>
+          </w:p>
+          <w:p>
+            <w:pPr>
+              <w:pStyle w:val="BodyText"/>
+              <w:widowControl w:val="false"/>
+              <w:spacing w:lineRule="auto" w:line="259" w:before="0" w:after="160"/>
+              <w:rPr>
+                <w:rFonts w:ascii="Times New Roman" w:hAnsi="Times New Roman"/>
+              </w:rPr>
+            </w:pPr>
+            <w:r>
+              <w:rPr>
+                <w:rFonts w:ascii="Times New Roman" w:hAnsi="Times New Roman"/>
+              </w:rPr>
+              <w:t xml:space="preserve">• </w:t>
+            </w:r>
+            <w:r>
+              <w:rPr>
+                <w:rFonts w:ascii="Times New Roman" w:hAnsi="Times New Roman"/>
+                <w:b/>
+              </w:rPr>
+              <w:t>Límite de aceleración (Ley de Amdahl):</w:t>
+            </w:r>
+            <w:r>
+              <w:rPr>
+                <w:rFonts w:ascii="Times New Roman" w:hAnsi="Times New Roman"/>
+              </w:rPr>
+              <w:t xml:space="preserve"> La ganancia se ve acotada por la parte estrictamente secuencial del código.</w:t>
+            </w:r>
+          </w:p>
+          <w:p>
+            <w:pPr>
+              <w:pStyle w:val="BodyText"/>
+              <w:widowControl w:val="false"/>
+              <w:spacing w:lineRule="auto" w:line="259" w:before="0" w:after="160"/>
+              <w:rPr>
+                <w:rFonts w:ascii="Times New Roman" w:hAnsi="Times New Roman"/>
+              </w:rPr>
+            </w:pPr>
+            <w:r>
+              <w:rPr>
+                <w:rFonts w:ascii="Times New Roman" w:hAnsi="Times New Roman"/>
+              </w:rPr>
+              <w:t xml:space="preserve">• </w:t>
+            </w:r>
+            <w:r>
+              <w:rPr>
+                <w:rFonts w:ascii="Times New Roman" w:hAnsi="Times New Roman"/>
+                <w:b/>
+              </w:rPr>
+              <w:t>Complejidad de descomposición:</w:t>
+            </w:r>
+            <w:r>
+              <w:rPr>
+                <w:rFonts w:ascii="Times New Roman" w:hAnsi="Times New Roman"/>
+              </w:rPr>
+              <w:t xml:space="preserve"> Difícil balancear la carga uniformemente y minimizar contención de memoria/caché.</w:t>
+            </w:r>
+          </w:p>
+        </w:tc>
+      </w:tr>
+      <w:tr>
+        <w:trPr/>
+        <w:tc>
+          <w:tcPr>
+            <w:tcW w:w="4252" w:type="dxa"/>
+            <w:tcBorders>
+              <w:top w:val="single" w:sz="4" w:space="0" w:color="000000"/>
+              <w:start w:val="single" w:sz="4" w:space="0" w:color="000000"/>
+              <w:bottom w:val="single" w:sz="4" w:space="0" w:color="000000"/>
+              <w:end w:val="single" w:sz="4" w:space="0" w:color="000000"/>
+            </w:tcBorders>
+          </w:tcPr>
+          <w:p>
+            <w:pPr>
+              <w:pStyle w:val="Contenidodelatabla"/>
+              <w:spacing w:before="0" w:after="160"/>
+              <w:rPr>
+                <w:rFonts w:ascii="Times New Roman" w:hAnsi="Times New Roman"/>
+              </w:rPr>
+            </w:pPr>
+            <w:r>
+              <w:rPr>
+                <w:rFonts w:ascii="Times New Roman" w:hAnsi="Times New Roman"/>
+              </w:rPr>
+              <w:t>Distribuida</w:t>
+            </w:r>
+          </w:p>
+        </w:tc>
+        <w:tc>
+          <w:tcPr>
+            <w:tcW w:w="4252" w:type="dxa"/>
+            <w:tcBorders>
+              <w:top w:val="single" w:sz="4" w:space="0" w:color="000000"/>
+              <w:start w:val="single" w:sz="4" w:space="0" w:color="000000"/>
+              <w:bottom w:val="single" w:sz="4" w:space="0" w:color="000000"/>
+              <w:end w:val="single" w:sz="4" w:space="0" w:color="000000"/>
+            </w:tcBorders>
+          </w:tcPr>
+          <w:p>
+            <w:pPr>
+              <w:pStyle w:val="BodyText"/>
+              <w:rPr>
+                <w:rFonts w:ascii="Times New Roman" w:hAnsi="Times New Roman"/>
+              </w:rPr>
+            </w:pPr>
+            <w:r>
+              <w:rPr>
+                <w:rFonts w:ascii="Times New Roman" w:hAnsi="Times New Roman"/>
+              </w:rPr>
+              <w:t xml:space="preserve">• </w:t>
+            </w:r>
+            <w:r>
+              <w:rPr>
+                <w:rFonts w:ascii="Times New Roman" w:hAnsi="Times New Roman"/>
+                <w:b/>
+              </w:rPr>
+              <w:t>Fallas de red y latencia:</w:t>
+            </w:r>
+            <w:r>
+              <w:rPr>
+                <w:rFonts w:ascii="Times New Roman" w:hAnsi="Times New Roman"/>
+              </w:rPr>
+              <w:t xml:space="preserve"> Las comunicaciones remotas introducen retardos impredecibles y desconexiones.</w:t>
+            </w:r>
+          </w:p>
+          <w:p>
+            <w:pPr>
+              <w:pStyle w:val="BodyText"/>
+              <w:widowControl w:val="false"/>
+              <w:spacing w:lineRule="auto" w:line="259" w:before="0" w:after="160"/>
+              <w:rPr>
+                <w:rFonts w:ascii="Times New Roman" w:hAnsi="Times New Roman"/>
+              </w:rPr>
+            </w:pPr>
+            <w:r>
+              <w:rPr>
+                <w:rFonts w:ascii="Times New Roman" w:hAnsi="Times New Roman"/>
+              </w:rPr>
+              <w:t xml:space="preserve">• </w:t>
+            </w:r>
+            <w:r>
+              <w:rPr>
+                <w:rFonts w:ascii="Times New Roman" w:hAnsi="Times New Roman"/>
+                <w:b/>
+              </w:rPr>
+              <w:t>Consistencia de datos compleja:</w:t>
+            </w:r>
+            <w:r>
+              <w:rPr>
+                <w:rFonts w:ascii="Times New Roman" w:hAnsi="Times New Roman"/>
+              </w:rPr>
+              <w:t xml:space="preserve"> Obliga a gestionar compromisos teóricos (Teorema CAP) y consistencia eventual.</w:t>
+            </w:r>
+          </w:p>
+          <w:p>
+            <w:pPr>
+              <w:pStyle w:val="BodyText"/>
+              <w:widowControl w:val="false"/>
+              <w:spacing w:lineRule="auto" w:line="259" w:before="0" w:after="160"/>
+              <w:rPr>
+                <w:rFonts w:ascii="Times New Roman" w:hAnsi="Times New Roman"/>
+              </w:rPr>
+            </w:pPr>
+            <w:r>
+              <w:rPr>
+                <w:rFonts w:ascii="Times New Roman" w:hAnsi="Times New Roman"/>
+              </w:rPr>
+              <w:t xml:space="preserve">• </w:t>
+            </w:r>
+            <w:r>
+              <w:rPr>
+                <w:rFonts w:ascii="Times New Roman" w:hAnsi="Times New Roman"/>
+                <w:b/>
+              </w:rPr>
+              <w:t>Operación y monitorización críticas:</w:t>
+            </w:r>
+            <w:r>
+              <w:rPr>
+                <w:rFonts w:ascii="Times New Roman" w:hAnsi="Times New Roman"/>
+              </w:rPr>
+              <w:t xml:space="preserve"> Requiere infraestructura pesada (orquestación, trazas distribuidas, seguridad de red).</w:t>
             </w:r>
           </w:p>
         </w:tc>
@@ -3283,7 +4466,7 @@
         </w:r>
         <w:r>
           <w:rPr/>
-          <w:t>3</w:t>
+          <w:t>4</w:t>
         </w:r>
         <w:r>
           <w:rPr/>
@@ -3335,7 +4518,7 @@
         </w:r>
         <w:r>
           <w:rPr/>
-          <w:t>3</w:t>
+          <w:t>4</w:t>
         </w:r>
         <w:r>
           <w:rPr/>
@@ -3382,7 +4565,7 @@
       <mc:AlternateContent>
         <mc:Choice Requires="wps">
           <w:drawing>
-            <wp:anchor distT="44450" distB="45085" distL="111760" distR="114300" simplePos="0" relativeHeight="6" behindDoc="1" locked="0" layoutInCell="0" allowOverlap="1" wp14:anchorId="6892547A">
+            <wp:anchor distT="44450" distB="45085" distL="111760" distR="114300" simplePos="0" relativeHeight="8" behindDoc="1" locked="0" layoutInCell="0" allowOverlap="1" wp14:anchorId="6892547A">
               <wp:simplePos x="0" y="0"/>
               <wp:positionH relativeFrom="column">
                 <wp:posOffset>3665855</wp:posOffset>
@@ -3516,7 +4699,7 @@
         </mc:Fallback>
       </mc:AlternateContent>
       <w:drawing>
-        <wp:anchor distT="0" distB="0" distL="114300" distR="114300" simplePos="0" relativeHeight="11" behindDoc="1" locked="0" layoutInCell="0" allowOverlap="1">
+        <wp:anchor distT="0" distB="0" distL="114300" distR="114300" simplePos="0" relativeHeight="14" behindDoc="1" locked="0" layoutInCell="0" allowOverlap="1">
           <wp:simplePos x="0" y="0"/>
           <wp:positionH relativeFrom="column">
             <wp:posOffset>-697865</wp:posOffset>
@@ -3578,7 +4761,7 @@
       <mc:AlternateContent>
         <mc:Choice Requires="wps">
           <w:drawing>
-            <wp:anchor distT="44450" distB="45085" distL="111760" distR="114300" simplePos="0" relativeHeight="6" behindDoc="1" locked="0" layoutInCell="0" allowOverlap="1" wp14:anchorId="6892547A">
+            <wp:anchor distT="44450" distB="45085" distL="111760" distR="114300" simplePos="0" relativeHeight="8" behindDoc="1" locked="0" layoutInCell="0" allowOverlap="1" wp14:anchorId="6892547A">
               <wp:simplePos x="0" y="0"/>
               <wp:positionH relativeFrom="column">
                 <wp:posOffset>3665855</wp:posOffset>
@@ -3712,7 +4895,7 @@
         </mc:Fallback>
       </mc:AlternateContent>
       <w:drawing>
-        <wp:anchor distT="0" distB="0" distL="114300" distR="114300" simplePos="0" relativeHeight="11" behindDoc="1" locked="0" layoutInCell="0" allowOverlap="1">
+        <wp:anchor distT="0" distB="0" distL="114300" distR="114300" simplePos="0" relativeHeight="14" behindDoc="1" locked="0" layoutInCell="0" allowOverlap="1">
           <wp:simplePos x="0" y="0"/>
           <wp:positionH relativeFrom="column">
             <wp:posOffset>-697865</wp:posOffset>

</xml_diff>